<commit_message>
Detecta operaciones PMR con histórico desactualizado respecto al ciclo vigente
Se agrega la constante única PMR_CURRENT_CYCLE (index.html) que controla el
encabezado del tab PMR y valida, contra PMR_Historico.xlsx, si el último
ciclo registrado por operación coincide con el vigente. Las tarjetas
desactualizadas muestran una advertencia visual sin alterar su clasificación
en los KPI (Satisfactorio/Alerta/Problema/Sin calificación siguen sumando el
total de tarjetas mostradas).

Se documenta el cambio en el change log del Excel, el README y el manual en
Word.

Co-Authored-By: Claude Sonnet 5 <noreply@anthropic.com>
Claude-Session: https://claude.ai/code/session_01GzaFw33TkXnEXgidB9vXGw
</commit_message>
<xml_diff>
--- a/Manual Torre de Control - CCR.docx
+++ b/Manual Torre de Control - CCR.docx
@@ -1064,6 +1064,69 @@
           <w:rFonts w:ascii="Calibri" w:cs="Calibri" w:eastAsia="Calibri" w:hAnsi="Calibri"/>
         </w:rPr>
         <w:t xml:space="preserve">Si una operación no tiene hoja en PMR_Historico.xlsx (o el archivo no está disponible), su tarjeta en el tab PMR se ve igual que hoy, sin insignia ni clic.</w:t>
+      </w:r>
+    </w:p>
+    <w:p>
+      <w:pPr>
+        <w:pStyle w:val="Heading2"/>
+        <w:spacing w:after="140" w:before="280"/>
+      </w:pPr>
+      <w:r>
+        <w:t xml:space="preserve">Ciclo vigente y detección de datos desactualizados</w:t>
+      </w:r>
+    </w:p>
+    <w:p>
+      <w:pPr>
+        <w:spacing w:after="160"/>
+      </w:pPr>
+      <w:r>
+        <w:rPr>
+          <w:rFonts w:ascii="Calibri" w:cs="Calibri" w:eastAsia="Calibri" w:hAnsi="Calibri"/>
+        </w:rPr>
+        <w:t xml:space="preserve">El ciclo PMR vigente lo define el administrador de la aplicación en el código del dashboard (no es un dato que se edite desde la carpeta compartida). Con base en ese ciclo, el dashboard valida automáticamente si el histórico de cada operación en PMR_Historico.xlsx está al día.</w:t>
+      </w:r>
+    </w:p>
+    <w:p>
+      <w:pPr>
+        <w:spacing w:after="160"/>
+      </w:pPr>
+      <w:r>
+        <w:rPr>
+          <w:rFonts w:ascii="Calibri" w:cs="Calibri" w:eastAsia="Calibri" w:hAnsi="Calibri"/>
+        </w:rPr>
+        <w:t xml:space="preserve">Si el ciclo más reciente registrado para una operación no coincide con el ciclo vigente, su tarjeta en el tab PMR muestra una advertencia como la siguiente:</w:t>
+      </w:r>
+    </w:p>
+    <w:p>
+      <w:pPr>
+        <w:pBdr>
+          <w:top w:val="single" w:color="E0A800" w:sz="4"/>
+          <w:bottom w:val="single" w:color="E0A800" w:sz="4"/>
+          <w:left w:val="single" w:color="E0A800" w:sz="4"/>
+          <w:right w:val="single" w:color="E0A800" w:sz="4"/>
+        </w:pBdr>
+        <w:shd w:fill="FFF3CD" w:val="clear"/>
+        <w:spacing w:after="200" w:before="100"/>
+        <w:ind w:left="100" w:right="100"/>
+      </w:pPr>
+      <w:r>
+        <w:rPr>
+          <w:rFonts w:ascii="Calibri" w:cs="Calibri" w:eastAsia="Calibri" w:hAnsi="Calibri"/>
+          <w:i/>
+          <w:iCs/>
+        </w:rPr>
+        <w:t xml:space="preserve">⚠ Datos de "&lt;ciclo&gt;" — no hay ciclo vigente (&lt;ciclo vigente&gt;) cargado en el histórico</w:t>
+      </w:r>
+    </w:p>
+    <w:p>
+      <w:pPr>
+        <w:spacing w:after="160"/>
+      </w:pPr>
+      <w:r>
+        <w:rPr>
+          <w:rFonts w:ascii="Calibri" w:cs="Calibri" w:eastAsia="Calibri" w:hAnsi="Calibri"/>
+        </w:rPr>
+        <w:t xml:space="preserve">Esa advertencia indica que a la operación le falta la fila del ciclo nuevo en PMR_Historico.xlsx — hay que agregarla siguiendo los pasos de "Cómo agregar ciclos históricos" de arriba. No cambia la calificación de la tarjeta en los KPI del tab (Satisfactorio / Alerta / Problema / Sin calificación); esos siguen sumando la calificación normal de PMR y su total sigue siendo igual a la cantidad de tarjetas mostradas. Las operaciones sin ninguna hoja en PMR_Historico.xlsx no se marcan como desactualizadas.</w:t>
       </w:r>
     </w:p>
     <w:p>
@@ -2065,7 +2128,7 @@
                 <w:sz w:val="20"/>
                 <w:szCs w:val="20"/>
               </w:rPr>
-              <w:t xml:space="preserve">Calificaciones e indicadores técnicos del ciclo PMR I-2026 por programa. Las tarjetas con histórico cargado son clicables y muestran la tabla de ciclos anteriores.</w:t>
+              <w:t xml:space="preserve">Calificaciones e indicadores técnicos del ciclo PMR vigente por programa. Las tarjetas con histórico cargado son clicables y muestran la tabla de ciclos anteriores; las que tienen el histórico desactualizado respecto al ciclo vigente muestran una advertencia.</w:t>
             </w:r>
           </w:p>
         </w:tc>

</xml_diff>

<commit_message>
Agrega botón de Provisionamiento Portal del Cliente en tab Documentos
- index.html: nuevo tipo de documento "Provisionamiento Portal del
  Cliente" en el mapa DTYPE de renderDocumentos(), con ícono, color y
  etiqueta propios (antes usaba el estilo genérico de fallback).
- README.md y Manual Torre de Control - CCR.docx: se documenta el
  nuevo tipo como ejemplo en la descripción de la hoja/tab documentos.
- torre_de_control_CCR.xlsx: se registra el cambio en la hoja change
  log (fila para CR-L1157, tab documentos).
</commit_message>
<xml_diff>
--- a/Manual Torre de Control - CCR.docx
+++ b/Manual Torre de Control - CCR.docx
@@ -128,19 +128,7 @@
         <w:rPr>
           <w:rFonts w:ascii="Calibri" w:eastAsia="Calibri" w:hAnsi="Calibri" w:cs="Calibri"/>
         </w:rPr>
-        <w:t xml:space="preserve"> — contiene información de productos críticos, adquisiciones críticas, equipo, documentos, resultados, comentarios de cláusulas y </w:t>
-      </w:r>
-      <w:r>
-        <w:rPr>
-          <w:rFonts w:ascii="Calibri" w:eastAsia="Calibri" w:hAnsi="Calibri" w:cs="Calibri"/>
-        </w:rPr>
-        <w:t>change log</w:t>
-      </w:r>
-      <w:r>
-        <w:rPr>
-          <w:rFonts w:ascii="Calibri" w:eastAsia="Calibri" w:hAnsi="Calibri" w:cs="Calibri"/>
-        </w:rPr>
-        <w:t>.</w:t>
+        <w:t xml:space="preserve"> — contiene información de productos críticos, adquisiciones críticas, equipo, documentos, resultados, comentarios de cláusulas y change log.</w:t>
       </w:r>
     </w:p>
     <w:p>
@@ -152,23 +140,13 @@
         </w:numPr>
         <w:spacing w:after="100"/>
       </w:pPr>
-      <w:proofErr w:type="gramStart"/>
       <w:r>
         <w:rPr>
           <w:rFonts w:ascii="Calibri" w:eastAsia="Calibri" w:hAnsi="Calibri" w:cs="Calibri"/>
           <w:b/>
           <w:bCs/>
         </w:rPr>
-        <w:t>Status</w:t>
-      </w:r>
-      <w:proofErr w:type="gramEnd"/>
-      <w:r>
-        <w:rPr>
-          <w:rFonts w:ascii="Calibri" w:eastAsia="Calibri" w:hAnsi="Calibri" w:cs="Calibri"/>
-          <w:b/>
-          <w:bCs/>
-        </w:rPr>
-        <w:t xml:space="preserve"> Date Clause Operation.csv</w:t>
+        <w:t xml:space="preserve">Status Date Clause Operation.csv</w:t>
       </w:r>
       <w:r>
         <w:rPr>
@@ -233,21 +211,7 @@
         <w:rPr>
           <w:rFonts w:ascii="Calibri" w:eastAsia="Calibri" w:hAnsi="Calibri" w:cs="Calibri"/>
         </w:rPr>
-        <w:t xml:space="preserve">Los archivos se leen directamente desde el repositorio de GitHub (a través de GitHub Pages) usando la API de GitHub. No se requiere instalación ni configuración de parte de quien consulta el dashboard — basta con abrir el </w:t>
-      </w:r>
-      <w:proofErr w:type="gramStart"/>
-      <w:r>
-        <w:rPr>
-          <w:rFonts w:ascii="Calibri" w:eastAsia="Calibri" w:hAnsi="Calibri" w:cs="Calibri"/>
-        </w:rPr>
-        <w:t>link</w:t>
-      </w:r>
-      <w:proofErr w:type="gramEnd"/>
-      <w:r>
-        <w:rPr>
-          <w:rFonts w:ascii="Calibri" w:eastAsia="Calibri" w:hAnsi="Calibri" w:cs="Calibri"/>
-        </w:rPr>
-        <w:t>.</w:t>
+        <w:t xml:space="preserve">Los archivos se leen directamente desde el repositorio de GitHub (a través de GitHub Pages) usando la API de GitHub. No se requiere instalación ni configuración de parte de quien consulta el dashboard — basta con abrir el link.</w:t>
       </w:r>
     </w:p>
     <w:p>
@@ -269,21 +233,7 @@
         <w:rPr>
           <w:rFonts w:ascii="Calibri" w:eastAsia="Calibri" w:hAnsi="Calibri" w:cs="Calibri"/>
         </w:rPr>
-        <w:t xml:space="preserve">Los datos se guardan en caché local (IndexedDB) para que la página cargue instantáneamente. Al abrir la </w:t>
-      </w:r>
-      <w:proofErr w:type="gramStart"/>
-      <w:r>
-        <w:rPr>
-          <w:rFonts w:ascii="Calibri" w:eastAsia="Calibri" w:hAnsi="Calibri" w:cs="Calibri"/>
-        </w:rPr>
-        <w:t>app</w:t>
-      </w:r>
-      <w:proofErr w:type="gramEnd"/>
-      <w:r>
-        <w:rPr>
-          <w:rFonts w:ascii="Calibri" w:eastAsia="Calibri" w:hAnsi="Calibri" w:cs="Calibri"/>
-        </w:rPr>
-        <w:t>, se muestra la versión en caché y se actualiza en segundo plano. El botón "Actualizar Datos" fuerza una recarga inmediata.</w:t>
+        <w:t xml:space="preserve">Los datos se guardan en caché local (IndexedDB) para que la página cargue instantáneamente. Al abrir la app, se muestra la versión en caché y se actualiza en segundo plano. El botón "Actualizar Datos" fuerza una recarga inmediata.</w:t>
       </w:r>
     </w:p>
     <w:p>
@@ -473,21 +423,7 @@
         <w:rPr>
           <w:rFonts w:ascii="Calibri" w:eastAsia="Calibri" w:hAnsi="Calibri" w:cs="Calibri"/>
         </w:rPr>
-        <w:t xml:space="preserve">Country = Costa Rica, Clause </w:t>
-      </w:r>
-      <w:proofErr w:type="gramStart"/>
-      <w:r>
-        <w:rPr>
-          <w:rFonts w:ascii="Calibri" w:eastAsia="Calibri" w:hAnsi="Calibri" w:cs="Calibri"/>
-        </w:rPr>
-        <w:t>Status</w:t>
-      </w:r>
-      <w:proofErr w:type="gramEnd"/>
-      <w:r>
-        <w:rPr>
-          <w:rFonts w:ascii="Calibri" w:eastAsia="Calibri" w:hAnsi="Calibri" w:cs="Calibri"/>
-        </w:rPr>
-        <w:t xml:space="preserve"> = ALL, Operation Stage = Disbursing</w:t>
+        <w:t xml:space="preserve">Country = Costa Rica, Clause Status = ALL, Operation Stage = Disbursing</w:t>
       </w:r>
     </w:p>
     <w:p>
@@ -866,11 +802,6 @@
           <w:rFonts w:ascii="Calibri" w:eastAsia="Calibri" w:hAnsi="Calibri" w:cs="Calibri"/>
         </w:rPr>
         <w:t xml:space="preserve">Operaciones con raw data hoy: CR-L1032 (3071_OC-CR), CR-L1139 (4864_OC-CR), CR-L1137 (4871_OC-CR), CR-J0002 (5777_GR-CR), CR-L1151 (5823_OC-CR), CR-L1157 (6061_OC-CR). Para el resto de las operaciones (sin raw data todavía), el </w:t>
-      </w:r>
-      <w:r>
-        <w:rPr>
-          <w:rFonts w:ascii="Calibri" w:eastAsia="Calibri" w:hAnsi="Calibri" w:cs="Calibri"/>
-        </w:rPr>
         <w:lastRenderedPageBreak/>
         <w:t>tab sigue mostrando el texto libre de las columnas Adquisición Crítica / Riesgos/Comentarios de productos criticos, como fallback automático.</w:t>
       </w:r>
@@ -2367,7 +2298,7 @@
               <w:rPr>
                 <w:rFonts w:ascii="Calibri" w:eastAsia="Calibri" w:hAnsi="Calibri" w:cs="Calibri"/>
               </w:rPr>
-              <w:t>Matriz de documentos clave con enlaces a SharePoint por tipo y operación.</w:t>
+              <w:t>Matriz de documentos clave con enlaces a SharePoint por tipo y operación (p. ej. Firma autorizada, PP, LC, ROP, PEP, Provisionamiento Portal del Cliente, entre otros).</w:t>
             </w:r>
           </w:p>
         </w:tc>
@@ -3151,7 +3082,7 @@
               <w:rPr>
                 <w:rFonts w:ascii="Calibri" w:eastAsia="Calibri" w:hAnsi="Calibri" w:cs="Calibri"/>
               </w:rPr>
-              <w:t>Matriz de documentos con links a SharePoint</w:t>
+              <w:t>Matriz de documentos con links a SharePoint (p. ej. Firma autorizada, PP, LC, ROP, PEP, Provisionamiento Portal del Cliente, entre otros)</w:t>
             </w:r>
           </w:p>
         </w:tc>

</xml_diff>